<commit_message>
Drop the pre-submission note about the repo being private
</commit_message>
<xml_diff>
--- a/target_validation/OFFTARGET_SAFETY_ARTICLE_UA.docx
+++ b/target_validation/OFFTARGET_SAFETY_ARTICLE_UA.docx
@@ -6644,53 +6644,25 @@
         <w:pStyle w:val="BodyText"/>
       </w:pPr>
       <w:r>
-        <w:rPr>
-          <w:i/>
-          <w:iCs/>
-        </w:rPr>
-        <w:t xml:space="preserve">[Примітка перед поданням: на момент підготовки рукопису репозиторій</w:t>
-      </w:r>
-      <w:r>
-        <w:rPr>
-          <w:i/>
-          <w:iCs/>
-        </w:rPr>
-        <w:t xml:space="preserve"> </w:t>
-      </w:r>
-      <w:r>
-        <w:rPr>
-          <w:i/>
-          <w:iCs/>
-        </w:rPr>
-        <w:t xml:space="preserve">приватний, тож наведене посилання повертає 404 для сторонніх читачів.</w:t>
-      </w:r>
-      <w:r>
-        <w:rPr>
-          <w:i/>
-          <w:iCs/>
-        </w:rPr>
-        <w:t xml:space="preserve"> </w:t>
-      </w:r>
-      <w:r>
-        <w:rPr>
-          <w:i/>
-          <w:iCs/>
-        </w:rPr>
-        <w:t xml:space="preserve">Перед поданням зробіть репозиторій публічним або замініть це посилання</w:t>
-      </w:r>
-      <w:r>
-        <w:rPr>
-          <w:i/>
-          <w:iCs/>
-        </w:rPr>
-        <w:t xml:space="preserve"> </w:t>
-      </w:r>
-      <w:r>
-        <w:rPr>
-          <w:i/>
-          <w:iCs/>
-        </w:rPr>
-        <w:t xml:space="preserve">на формулювання «доступно від автора для листування за запитом».]</w:t>
+        <w:t xml:space="preserve">Репозиторій відкритий публічно; доступність посилання перевірено</w:t>
+      </w:r>
+      <w:r>
+        <w:t xml:space="preserve"> </w:t>
+      </w:r>
+      <w:r>
+        <w:t xml:space="preserve">8 жовтня 2026 р. Матеріали батьківського проєкту, на які вказують</w:t>
+      </w:r>
+      <w:r>
+        <w:t xml:space="preserve"> </w:t>
+      </w:r>
+      <w:r>
+        <w:t xml:space="preserve">перехресні посилання вище, залишаються закритими і доступні від автора</w:t>
+      </w:r>
+      <w:r>
+        <w:t xml:space="preserve"> </w:t>
+      </w:r>
+      <w:r>
+        <w:t xml:space="preserve">для листування за запитом.</w:t>
       </w:r>
     </w:p>
     <w:p>

</xml_diff>